<commit_message>
Re-parse non-statutory documents (linker 51874d9, SC 140/194 fixes)
- original: SC Cosit 140/2015 and 194/2015 .docx fixed by hand
- lexml/nao_articulados: full re-parse with lexml_nonstat e8c3d1e, linker
  51874d9 (fresh cache .cache/linker_51874d9), referee cache
  .cache/referee; Remissao 4,561 -> 5,277, "!art" links 1,700 -> 3,808
- details: docs/20261009_121822_nonstat_reparse_decision_and_pipeline_rerun_log.md §3, §8.1

Co-Authored-By: Claude Opus 5.5 (1M context) <noreply@anthropic.com>
</commit_message>
<xml_diff>
--- a/original/nao_articulados/sc_cosit_140_20150605.docx
+++ b/original/nao_articulados/sc_cosit_140_20150605.docx
@@ -370,7 +370,21 @@
         <w:rPr>
           <w:lang w:val="pt-BR"/>
         </w:rPr>
-        <w:t>I - de todos os rendimentos percebidos durante o ano-calendário, exceto os isentos, os não-tributáveis, os tributáveis exclusivamente na fonte e os sujeitos à tributação definitiva;</w:t>
+        <w:t xml:space="preserve">I - </w:t>
+      </w:r>
+      <w:proofErr w:type="gramStart"/>
+      <w:r>
+        <w:rPr>
+          <w:lang w:val="pt-BR"/>
+        </w:rPr>
+        <w:t>de</w:t>
+      </w:r>
+      <w:proofErr w:type="gramEnd"/>
+      <w:r>
+        <w:rPr>
+          <w:lang w:val="pt-BR"/>
+        </w:rPr>
+        <w:t xml:space="preserve"> todos os rendimentos percebidos durante o ano-calendário, exceto os isentos, os não-tributáveis, os tributáveis exclusivamente na fonte e os sujeitos à tributação definitiva;</w:t>
       </w:r>
     </w:p>
     <w:p>
@@ -383,7 +397,21 @@
         <w:rPr>
           <w:lang w:val="pt-BR"/>
         </w:rPr>
-        <w:t>II - das deduções relativas:</w:t>
+        <w:t xml:space="preserve">II - </w:t>
+      </w:r>
+      <w:proofErr w:type="gramStart"/>
+      <w:r>
+        <w:rPr>
+          <w:lang w:val="pt-BR"/>
+        </w:rPr>
+        <w:t>das</w:t>
+      </w:r>
+      <w:proofErr w:type="gramEnd"/>
+      <w:r>
+        <w:rPr>
+          <w:lang w:val="pt-BR"/>
+        </w:rPr>
+        <w:t xml:space="preserve"> deduções relativas:</w:t>
       </w:r>
     </w:p>
     <w:p>
@@ -436,7 +464,21 @@
         <w:rPr>
           <w:lang w:val="pt-BR"/>
         </w:rPr>
-        <w:t>I - aplica-se, também, aos pagamentos efetuados a empresas domiciliadas no País, destinados à cobertura de despesas com hospitalização, médicas e</w:t>
+        <w:t xml:space="preserve">I - </w:t>
+      </w:r>
+      <w:proofErr w:type="gramStart"/>
+      <w:r>
+        <w:rPr>
+          <w:lang w:val="pt-BR"/>
+        </w:rPr>
+        <w:t>aplica-se</w:t>
+      </w:r>
+      <w:proofErr w:type="gramEnd"/>
+      <w:r>
+        <w:rPr>
+          <w:lang w:val="pt-BR"/>
+        </w:rPr>
+        <w:t>, também, aos pagamentos efetuados a empresas domiciliadas no País, destinados à cobertura de despesas com hospitalização, médicas e</w:t>
       </w:r>
       <w:r>
         <w:rPr>
@@ -461,7 +503,21 @@
         <w:rPr>
           <w:lang w:val="pt-BR"/>
         </w:rPr>
-        <w:t>II - restringe-se aos pagamentos efetuados pelo contribuinte, relativos ao próprio tratamento e ao de seus dependentes;</w:t>
+        <w:t xml:space="preserve">II - </w:t>
+      </w:r>
+      <w:proofErr w:type="gramStart"/>
+      <w:r>
+        <w:rPr>
+          <w:lang w:val="pt-BR"/>
+        </w:rPr>
+        <w:t>restringe-se</w:t>
+      </w:r>
+      <w:proofErr w:type="gramEnd"/>
+      <w:r>
+        <w:rPr>
+          <w:lang w:val="pt-BR"/>
+        </w:rPr>
+        <w:t xml:space="preserve"> aos pagamentos efetuados pelo contribuinte, relativos ao próprio tratamento e ao de seus dependentes;</w:t>
       </w:r>
     </w:p>
     <w:p>
@@ -487,7 +543,21 @@
         <w:rPr>
           <w:lang w:val="pt-BR"/>
         </w:rPr>
-        <w:t>IV - não se aplica às despesas ressarcidas por entidade de qualquer espécie ou cobertas por contrato de seguro;</w:t>
+        <w:t xml:space="preserve">IV - </w:t>
+      </w:r>
+      <w:proofErr w:type="gramStart"/>
+      <w:r>
+        <w:rPr>
+          <w:lang w:val="pt-BR"/>
+        </w:rPr>
+        <w:t>não</w:t>
+      </w:r>
+      <w:proofErr w:type="gramEnd"/>
+      <w:r>
+        <w:rPr>
+          <w:lang w:val="pt-BR"/>
+        </w:rPr>
+        <w:t xml:space="preserve"> se aplica às despesas ressarcidas por entidade de qualquer espécie ou cobertas por contrato de seguro;</w:t>
       </w:r>
     </w:p>
     <w:p>
@@ -500,7 +570,21 @@
         <w:rPr>
           <w:lang w:val="pt-BR"/>
         </w:rPr>
-        <w:t>V - no caso de despesas com aparelhos ortopédicos e próteses ortopédicas e dentárias, exige-se a comprovação com receituário médico e nota fiscal em nome do beneficiário.</w:t>
+        <w:t xml:space="preserve">V - </w:t>
+      </w:r>
+      <w:proofErr w:type="gramStart"/>
+      <w:r>
+        <w:rPr>
+          <w:lang w:val="pt-BR"/>
+        </w:rPr>
+        <w:t>no</w:t>
+      </w:r>
+      <w:proofErr w:type="gramEnd"/>
+      <w:r>
+        <w:rPr>
+          <w:lang w:val="pt-BR"/>
+        </w:rPr>
+        <w:t xml:space="preserve"> caso de despesas com aparelhos ortopédicos e próteses ortopédicas e dentárias, exige-se a comprovação com receituário médico e nota fiscal em nome do beneficiário.</w:t>
       </w:r>
     </w:p>
     <w:p>
@@ -780,8 +864,16 @@
         <w:rPr>
           <w:lang w:val="pt-BR"/>
         </w:rPr>
-        <w:t>10. Com relação ao argumento apresentado pelo Consulente, de que o nascituro a ser gerado será filho de ambos, esse não se sustenta perante a legislação vigente. Reportando-se novamente à publicação “Imposto de Renda da Pessoa Física - Perguntas e Respostas - 2015”, o item 323 relaciona aqueles que podem ser dependentes na DIRPF (art. 35 da Lei nº 9.250, de 26 de dezembro de 1995; art. 90 da Instrução Normativa RFB nº 1.500, de 29 de outubro de 2014) :</w:t>
-      </w:r>
+        <w:t>10. Com relação ao argumento apresentado pelo Consulente, de que o nascituro a ser gerado será filho de ambos, esse não se sustenta perante a legislação vigente. Reportando-se novamente à publicação “Imposto de Renda da Pessoa Física - Perguntas e Respostas - 2015”, o item 323 relaciona aqueles que podem ser dependentes na DIRPF (art. 35 da Lei nº 9.250, de 26 de dezembro de 1995; art. 90 da Instrução Normativa RFB nº 1.500, de 29 de outubro de 2014</w:t>
+      </w:r>
+      <w:proofErr w:type="gramStart"/>
+      <w:r>
+        <w:rPr>
+          <w:lang w:val="pt-BR"/>
+        </w:rPr>
+        <w:t>) :</w:t>
+      </w:r>
+      <w:proofErr w:type="gramEnd"/>
     </w:p>
     <w:p>
       <w:pPr>
@@ -832,7 +924,21 @@
         <w:rPr>
           <w:lang w:val="pt-BR"/>
         </w:rPr>
-        <w:t>1 - companheiro(a) com quem o contribuinte tenha filho ou viva há mais de 5 anos, ou cônjuge;</w:t>
+        <w:t xml:space="preserve">1 - </w:t>
+      </w:r>
+      <w:proofErr w:type="gramStart"/>
+      <w:r>
+        <w:rPr>
+          <w:lang w:val="pt-BR"/>
+        </w:rPr>
+        <w:t>companheiro</w:t>
+      </w:r>
+      <w:proofErr w:type="gramEnd"/>
+      <w:r>
+        <w:rPr>
+          <w:lang w:val="pt-BR"/>
+        </w:rPr>
+        <w:t>(a) com quem o contribuinte tenha filho ou viva há mais de 5 anos, ou cônjuge;</w:t>
       </w:r>
     </w:p>
     <w:p>
@@ -846,7 +952,21 @@
           <w:lang w:val="pt-BR"/>
         </w:rPr>
         <w:lastRenderedPageBreak/>
-        <w:t>2 - filho(a) ou enteado(a), até 21 anos de idade, ou, em qualquer idade, quando incapacitado física ou mentalmente para o trabalho;</w:t>
+        <w:t xml:space="preserve">2 - </w:t>
+      </w:r>
+      <w:proofErr w:type="gramStart"/>
+      <w:r>
+        <w:rPr>
+          <w:lang w:val="pt-BR"/>
+        </w:rPr>
+        <w:t>filho</w:t>
+      </w:r>
+      <w:proofErr w:type="gramEnd"/>
+      <w:r>
+        <w:rPr>
+          <w:lang w:val="pt-BR"/>
+        </w:rPr>
+        <w:t>(a) ou enteado(a), até 21 anos de idade, ou, em qualquer idade, quando incapacitado física ou mentalmente para o trabalho;</w:t>
       </w:r>
     </w:p>
     <w:p>
@@ -859,7 +979,21 @@
         <w:rPr>
           <w:lang w:val="pt-BR"/>
         </w:rPr>
-        <w:t>3 - filho(a) ou enteado(a), se ainda estiverem cursando estabelecimento de ensino superior ou escola técnica de segundo grau, até 24 anos de idade;</w:t>
+        <w:t xml:space="preserve">3 - </w:t>
+      </w:r>
+      <w:proofErr w:type="gramStart"/>
+      <w:r>
+        <w:rPr>
+          <w:lang w:val="pt-BR"/>
+        </w:rPr>
+        <w:t>filho</w:t>
+      </w:r>
+      <w:proofErr w:type="gramEnd"/>
+      <w:r>
+        <w:rPr>
+          <w:lang w:val="pt-BR"/>
+        </w:rPr>
+        <w:t>(a) ou enteado(a), se ainda estiverem cursando estabelecimento de ensino superior ou escola técnica de segundo grau, até 24 anos de idade;</w:t>
       </w:r>
     </w:p>
     <w:p>
@@ -872,7 +1006,21 @@
         <w:rPr>
           <w:lang w:val="pt-BR"/>
         </w:rPr>
-        <w:t>4 - irmão(ã), neto(a) ou bisneto(a), sem arrimo dos pais, de quem o contribuinte detenha a guarda judicial, até 21 anos, ou em qualquer idade, quando incapacitado física ou mentalmente para o trabalho;</w:t>
+        <w:t xml:space="preserve">4 - </w:t>
+      </w:r>
+      <w:proofErr w:type="gramStart"/>
+      <w:r>
+        <w:rPr>
+          <w:lang w:val="pt-BR"/>
+        </w:rPr>
+        <w:t>irmão</w:t>
+      </w:r>
+      <w:proofErr w:type="gramEnd"/>
+      <w:r>
+        <w:rPr>
+          <w:lang w:val="pt-BR"/>
+        </w:rPr>
+        <w:t>(ã), neto(a) ou bisneto(a), sem arrimo dos pais, de quem o contribuinte detenha a guarda judicial, até 21 anos, ou em qualquer idade, quando incapacitado física ou mentalmente para o trabalho;</w:t>
       </w:r>
     </w:p>
     <w:p>
@@ -885,7 +1033,21 @@
         <w:rPr>
           <w:lang w:val="pt-BR"/>
         </w:rPr>
-        <w:t>5 - irmão(ã), neto(a) ou bisneto(a), sem arrimo dos pais, com idade de 21 anos até 24 anos, se ainda estiver cursando estabelecimento de ensino superior ou escola técnica de segundo grau, desde que o contribuinte tenha detido sua guarda judicial até os 21 anos;</w:t>
+        <w:t xml:space="preserve">5 - </w:t>
+      </w:r>
+      <w:proofErr w:type="gramStart"/>
+      <w:r>
+        <w:rPr>
+          <w:lang w:val="pt-BR"/>
+        </w:rPr>
+        <w:t>irmão</w:t>
+      </w:r>
+      <w:proofErr w:type="gramEnd"/>
+      <w:r>
+        <w:rPr>
+          <w:lang w:val="pt-BR"/>
+        </w:rPr>
+        <w:t>(ã), neto(a) ou bisneto(a), sem arrimo dos pais, com idade de 21 anos até 24 anos, se ainda estiver cursando estabelecimento de ensino superior ou escola técnica de segundo grau, desde que o contribuinte tenha detido sua guarda judicial até os 21 anos;</w:t>
       </w:r>
     </w:p>
     <w:p>
@@ -898,7 +1060,21 @@
         <w:rPr>
           <w:lang w:val="pt-BR"/>
         </w:rPr>
-        <w:t>6 - pais, avós e bisavós que, em 2014, tenham recebido rendimentos, tributáveis ou não, até R$ 21.453,24;</w:t>
+        <w:t xml:space="preserve">6 - </w:t>
+      </w:r>
+      <w:proofErr w:type="gramStart"/>
+      <w:r>
+        <w:rPr>
+          <w:lang w:val="pt-BR"/>
+        </w:rPr>
+        <w:t>pais</w:t>
+      </w:r>
+      <w:proofErr w:type="gramEnd"/>
+      <w:r>
+        <w:rPr>
+          <w:lang w:val="pt-BR"/>
+        </w:rPr>
+        <w:t>, avós e bisavós que, em 2014, tenham recebido rendimentos, tributáveis ou não, até R$ 21.453,24;</w:t>
       </w:r>
     </w:p>
     <w:p>
@@ -911,7 +1087,21 @@
         <w:rPr>
           <w:lang w:val="pt-BR"/>
         </w:rPr>
-        <w:t>7 - menor pobre até 21 anos que o contribuinte crie e eduque e de quem detenha a guarda judicial;</w:t>
+        <w:t xml:space="preserve">7 - </w:t>
+      </w:r>
+      <w:proofErr w:type="gramStart"/>
+      <w:r>
+        <w:rPr>
+          <w:lang w:val="pt-BR"/>
+        </w:rPr>
+        <w:t>menor</w:t>
+      </w:r>
+      <w:proofErr w:type="gramEnd"/>
+      <w:r>
+        <w:rPr>
+          <w:lang w:val="pt-BR"/>
+        </w:rPr>
+        <w:t xml:space="preserve"> pobre até 21 anos que o contribuinte crie e eduque e de quem detenha a guarda judicial;</w:t>
       </w:r>
     </w:p>
     <w:p>
@@ -924,7 +1114,21 @@
         <w:rPr>
           <w:lang w:val="pt-BR"/>
         </w:rPr>
-        <w:t>8 - pessoa absolutamente incapaz, da qual o contribuinte seja tutor ou curador.</w:t>
+        <w:t xml:space="preserve">8 - </w:t>
+      </w:r>
+      <w:proofErr w:type="gramStart"/>
+      <w:r>
+        <w:rPr>
+          <w:lang w:val="pt-BR"/>
+        </w:rPr>
+        <w:t>pessoa</w:t>
+      </w:r>
+      <w:proofErr w:type="gramEnd"/>
+      <w:r>
+        <w:rPr>
+          <w:lang w:val="pt-BR"/>
+        </w:rPr>
+        <w:t xml:space="preserve"> absolutamente incapaz, da qual o contribuinte seja tutor ou curador.</w:t>
       </w:r>
     </w:p>
     <w:p>
@@ -989,7 +1193,21 @@
         <w:rPr>
           <w:lang w:val="pt-BR"/>
         </w:rPr>
-        <w:t>o contribuinte pode considerar como dependentes os filhos que ficarem sob sua guarda, em cumprimento de decisão judicial ou acordo homologado judicialmente. Nesse caso, deve oferecer à tributação, na sua declaração os rendimentos recebidos pelos filhos, inclusive a importância recebida do ex- cônjuge a título de pensão alimentícia;</w:t>
+        <w:t xml:space="preserve">o contribuinte pode considerar como dependentes os filhos que ficarem sob sua guarda, em cumprimento de decisão judicial ou acordo homologado judicialmente. Nesse caso, deve oferecer à tributação, na sua declaração os rendimentos recebidos pelos filhos, inclusive a importância recebida do </w:t>
+      </w:r>
+      <w:proofErr w:type="gramStart"/>
+      <w:r>
+        <w:rPr>
+          <w:lang w:val="pt-BR"/>
+        </w:rPr>
+        <w:t>ex- cônjuge</w:t>
+      </w:r>
+      <w:proofErr w:type="gramEnd"/>
+      <w:r>
+        <w:rPr>
+          <w:lang w:val="pt-BR"/>
+        </w:rPr>
+        <w:t xml:space="preserve"> a título de pensão alimentícia;</w:t>
       </w:r>
     </w:p>
     <w:p>
@@ -1022,7 +1240,21 @@
           <w:lang w:val="pt-BR"/>
         </w:rPr>
         <w:lastRenderedPageBreak/>
-        <w:t>no caso de separação judicial ocorrida em 2014, quando podem ser deduzidos, nesse ano, os valores relativos a dependente e a pensão alimentícia judicial paga.</w:t>
+        <w:t xml:space="preserve">no caso de separação judicial ocorrida em 2014, quando podem ser deduzidos, nesse ano, os valores relativos </w:t>
+      </w:r>
+      <w:proofErr w:type="gramStart"/>
+      <w:r>
+        <w:rPr>
+          <w:lang w:val="pt-BR"/>
+        </w:rPr>
+        <w:t>a</w:t>
+      </w:r>
+      <w:proofErr w:type="gramEnd"/>
+      <w:r>
+        <w:rPr>
+          <w:lang w:val="pt-BR"/>
+        </w:rPr>
+        <w:t xml:space="preserve"> dependente e a pensão alimentícia judicial paga.</w:t>
       </w:r>
     </w:p>
     <w:p>
@@ -1064,128 +1296,18 @@
         <w:t>11. De imediato, verifica-se que o nascituro ainda em gestação não se encontra elencado entre aqueles passíveis de serem considerados como dependente. Ademais, a análise do texto transcrito acima, revela que a conceituação de quem seja dependente vincula-se com a condição de personalidade civil do indivíduo, sendo que o direito brasileiro adota a teoria natalista, a qual afirma que o nascituro possui mera expectativa de direito, só fazendo jus à personalidade após o nascimento com vida, conforme se depreende da leitura do art. 2º da Lei nº 10.406, de 10 de janeiro de 2002 (Código Civil): (sublinhou-se)</w:t>
       </w:r>
     </w:p>
-    <w:tbl>
-      <w:tblPr>
-        <w:tblStyle w:val="LightGrid-Accent1"/>
-        <w:tblW w:w="0" w:type="auto"/>
-        <w:tblLook w:val="04A0" w:firstRow="1" w:lastRow="0" w:firstColumn="1" w:lastColumn="0" w:noHBand="0" w:noVBand="1"/>
-      </w:tblPr>
-      <w:tblGrid>
-        <w:gridCol w:w="2880"/>
-        <w:gridCol w:w="2880"/>
-        <w:gridCol w:w="2880"/>
-      </w:tblGrid>
-      <w:tr>
-        <w:trPr>
-          <w:cnfStyle w:val="100000000000" w:firstRow="1" w:lastRow="0" w:firstColumn="0" w:lastColumn="0" w:oddVBand="0" w:evenVBand="0" w:oddHBand="0" w:evenHBand="0" w:firstRowFirstColumn="0" w:firstRowLastColumn="0" w:lastRowFirstColumn="0" w:lastRowLastColumn="0"/>
-        </w:trPr>
-        <w:tc>
-          <w:tcPr>
-            <w:cnfStyle w:val="001000000000" w:firstRow="0" w:lastRow="0" w:firstColumn="1" w:lastColumn="0" w:oddVBand="0" w:evenVBand="0" w:oddHBand="0" w:evenHBand="0" w:firstRowFirstColumn="0" w:firstRowLastColumn="0" w:lastRowFirstColumn="0" w:lastRowLastColumn="0"/>
-            <w:tcW w:w="2880" w:type="dxa"/>
-          </w:tcPr>
-          <w:p>
-            <w:r>
-              <w:t>natalista, a qual</w:t>
-            </w:r>
-          </w:p>
-        </w:tc>
-        <w:tc>
-          <w:tcPr>
-            <w:tcW w:w="2880" w:type="dxa"/>
-          </w:tcPr>
-          <w:p>
-            <w:pPr>
-              <w:cnfStyle w:val="100000000000" w:firstRow="1" w:lastRow="0" w:firstColumn="0" w:lastColumn="0" w:oddVBand="0" w:evenVBand="0" w:oddHBand="0" w:evenHBand="0" w:firstRowFirstColumn="0" w:firstRowLastColumn="0" w:lastRowFirstColumn="0" w:lastRowLastColumn="0"/>
-              <w:rPr>
-                <w:lang w:val="pt-BR"/>
-              </w:rPr>
-            </w:pPr>
-            <w:r>
-              <w:rPr>
-                <w:lang w:val="pt-BR"/>
-              </w:rPr>
-              <w:t>afirma que o nascituro possui mera expectativa de direito, só fazendo jus à</w:t>
-            </w:r>
-          </w:p>
-        </w:tc>
-        <w:tc>
-          <w:tcPr>
-            <w:tcW w:w="2880" w:type="dxa"/>
-          </w:tcPr>
-          <w:p>
-            <w:pPr>
-              <w:cnfStyle w:val="100000000000" w:firstRow="1" w:lastRow="0" w:firstColumn="0" w:lastColumn="0" w:oddVBand="0" w:evenVBand="0" w:oddHBand="0" w:evenHBand="0" w:firstRowFirstColumn="0" w:firstRowLastColumn="0" w:lastRowFirstColumn="0" w:lastRowLastColumn="0"/>
-              <w:rPr>
-                <w:lang w:val="pt-BR"/>
-              </w:rPr>
-            </w:pPr>
-          </w:p>
-        </w:tc>
-      </w:tr>
-      <w:tr>
-        <w:trPr>
-          <w:cnfStyle w:val="000000100000" w:firstRow="0" w:lastRow="0" w:firstColumn="0" w:lastColumn="0" w:oddVBand="0" w:evenVBand="0" w:oddHBand="1" w:evenHBand="0" w:firstRowFirstColumn="0" w:firstRowLastColumn="0" w:lastRowFirstColumn="0" w:lastRowLastColumn="0"/>
-        </w:trPr>
-        <w:tc>
-          <w:tcPr>
-            <w:cnfStyle w:val="001000000000" w:firstRow="0" w:lastRow="0" w:firstColumn="1" w:lastColumn="0" w:oddVBand="0" w:evenVBand="0" w:oddHBand="0" w:evenHBand="0" w:firstRowFirstColumn="0" w:firstRowLastColumn="0" w:lastRowFirstColumn="0" w:lastRowLastColumn="0"/>
-            <w:tcW w:w="2880" w:type="dxa"/>
-          </w:tcPr>
-          <w:p>
-            <w:pPr>
-              <w:rPr>
-                <w:lang w:val="pt-BR"/>
-              </w:rPr>
-            </w:pPr>
-            <w:r>
-              <w:rPr>
-                <w:lang w:val="pt-BR"/>
-              </w:rPr>
-              <w:t>personalidade após o nascimento com vida, conforme se depreende da leitura d</w:t>
-            </w:r>
-          </w:p>
-        </w:tc>
-        <w:tc>
-          <w:tcPr>
-            <w:tcW w:w="2880" w:type="dxa"/>
-          </w:tcPr>
-          <w:p>
-            <w:pPr>
-              <w:cnfStyle w:val="000000100000" w:firstRow="0" w:lastRow="0" w:firstColumn="0" w:lastColumn="0" w:oddVBand="0" w:evenVBand="0" w:oddHBand="1" w:evenHBand="0" w:firstRowFirstColumn="0" w:firstRowLastColumn="0" w:lastRowFirstColumn="0" w:lastRowLastColumn="0"/>
-              <w:rPr>
-                <w:lang w:val="pt-BR"/>
-              </w:rPr>
-            </w:pPr>
-          </w:p>
-        </w:tc>
-        <w:tc>
-          <w:tcPr>
-            <w:tcW w:w="2880" w:type="dxa"/>
-          </w:tcPr>
-          <w:p>
-            <w:pPr>
-              <w:cnfStyle w:val="000000100000" w:firstRow="0" w:lastRow="0" w:firstColumn="0" w:lastColumn="0" w:oddVBand="0" w:evenVBand="0" w:oddHBand="1" w:evenHBand="0" w:firstRowFirstColumn="0" w:firstRowLastColumn="0" w:lastRowFirstColumn="0" w:lastRowLastColumn="0"/>
-              <w:rPr>
-                <w:lang w:val="pt-BR"/>
-              </w:rPr>
-            </w:pPr>
-            <w:r>
-              <w:rPr>
-                <w:lang w:val="pt-BR"/>
-              </w:rPr>
-              <w:t>o art. 2º da Lei</w:t>
-            </w:r>
-          </w:p>
-        </w:tc>
-      </w:tr>
-    </w:tbl>
     <w:p>
       <w:pPr>
         <w:rPr>
           <w:lang w:val="pt-BR"/>
         </w:rPr>
       </w:pPr>
+      <w:r>
+        <w:rPr>
+          <w:lang w:val="pt-BR"/>
+        </w:rPr>
+        <w:t xml:space="preserve"> </w:t>
+      </w:r>
       <w:r>
         <w:rPr>
           <w:lang w:val="pt-BR"/>
@@ -1294,7 +1416,6 @@
         <w:rPr>
           <w:lang w:val="pt-BR"/>
         </w:rPr>
-        <w:lastRenderedPageBreak/>
         <w:t>SÉRGIO RODRIGUES DE CARVALHO</w:t>
       </w:r>
     </w:p>
@@ -1347,6 +1468,7 @@
         <w:rPr>
           <w:lang w:val="pt-BR"/>
         </w:rPr>
+        <w:lastRenderedPageBreak/>
         <w:t>MARCOS VINICIUS GIACOMELLI</w:t>
       </w:r>
     </w:p>

</xml_diff>